<commit_message>
Add Day 14 temperature converter
</commit_message>
<xml_diff>
--- a/DAY 4/task4.docx
+++ b/DAY 4/task4.docx
@@ -2,7 +2,1031 @@
 <file path=word/document.xml><?xml version="1.0" encoding="utf-8"?>
 <w:document xmlns:wpc="http://schemas.microsoft.com/office/word/2010/wordprocessingCanvas" xmlns:cx="http://schemas.microsoft.com/office/drawing/2014/chartex" xmlns:cx1="http://schemas.microsoft.com/office/drawing/2015/9/8/chartex" xmlns:cx2="http://schemas.microsoft.com/office/drawing/2015/10/21/chartex" xmlns:cx3="http://schemas.microsoft.com/office/drawing/2016/5/9/chartex" xmlns:cx4="http://schemas.microsoft.com/office/drawing/2016/5/10/chartex" xmlns:cx5="http://schemas.microsoft.com/office/drawing/2016/5/11/chartex" xmlns:cx6="http://schemas.microsoft.com/office/drawing/2016/5/12/chartex" xmlns:cx7="http://schemas.microsoft.com/office/drawing/2016/5/13/chartex" xmlns:cx8="http://schemas.microsoft.com/office/drawing/2016/5/14/chartex" xmlns:mc="http://schemas.openxmlformats.org/markup-compatibility/2006" xmlns:aink="http://schemas.microsoft.com/office/drawing/2016/ink" xmlns:am3d="http://schemas.microsoft.com/office/drawing/2017/model3d" xmlns:o="urn:schemas-microsoft-com:office:office" xmlns:oel="http://schemas.microsoft.com/office/2019/extlst" xmlns:r="http://schemas.openxmlformats.org/officeDocument/2006/relationships" xmlns:m="http://schemas.openxmlformats.org/officeDocument/2006/math" xmlns:v="urn:schemas-microsoft-com:vml" xmlns:wp14="http://schemas.microsoft.com/office/word/2010/wordprocessingDrawing" xmlns:wp="http://schemas.openxmlformats.org/drawingml/2006/wordprocessingDrawing" xmlns:w10="urn:schemas-microsoft-com:office:word" xmlns:w="http://schemas.openxmlformats.org/wordprocessingml/2006/main" xmlns:w14="http://schemas.microsoft.com/office/word/2010/wordml" xmlns:w15="http://schemas.microsoft.com/office/word/2012/wordml" xmlns:w16cex="http://schemas.microsoft.com/office/word/2018/wordml/cex" xmlns:w16cid="http://schemas.microsoft.com/office/word/2016/wordml/cid" xmlns:w16="http://schemas.microsoft.com/office/word/2018/wordml" xmlns:w16du="http://schemas.microsoft.com/office/word/2023/wordml/word16du" xmlns:w16sdtdh="http://schemas.microsoft.com/office/word/2020/wordml/sdtdatahash" xmlns:w16sdtfl="http://schemas.microsoft.com/office/word/2024/wordml/sdtformatlock" xmlns:w16se="http://schemas.microsoft.com/office/word/2015/wordml/symex" xmlns:wpg="http://schemas.microsoft.com/office/word/2010/wordprocessingGroup" xmlns:wpi="http://schemas.microsoft.com/office/word/2010/wordprocessingInk" xmlns:wne="http://schemas.microsoft.com/office/word/2006/wordml" xmlns:wps="http://schemas.microsoft.com/office/word/2010/wordprocessingShape" mc:Ignorable="w14 w15 w16se w16cid w16 w16cex w16sdtdh w16sdtfl w16du wp14">
   <w:body>
+    <w:p>
+      <w:pPr>
+        <w:rPr>
+          <w:b/>
+          <w:bCs/>
+        </w:rPr>
+      </w:pPr>
+      <w:r>
+        <w:rPr>
+          <w:b/>
+          <w:bCs/>
+        </w:rPr>
+        <w:t>Objective</w:t>
+      </w:r>
+    </w:p>
+    <w:p>
+      <w:r>
+        <w:t xml:space="preserve">The objective of this project is to develop a Python-based </w:t>
+      </w:r>
+      <w:r>
+        <w:rPr>
+          <w:b/>
+          <w:bCs/>
+        </w:rPr>
+        <w:t>Student Grade Calculator</w:t>
+      </w:r>
+      <w:r>
+        <w:t xml:space="preserve"> that accepts marks for multiple subjects and calculates the student's total marks and percentage. Based on predefined percentage conditions, the program assigns an appropriate grade. The project also focuses on practicing </w:t>
+      </w:r>
+      <w:r>
+        <w:rPr>
+          <w:b/>
+          <w:bCs/>
+        </w:rPr>
+        <w:t>conditional statements, arithmetic operations, user input, and input validation</w:t>
+      </w:r>
+      <w:r>
+        <w:t>.</w:t>
+      </w:r>
+    </w:p>
+    <w:p>
+      <w:pPr>
+        <w:rPr>
+          <w:b/>
+          <w:bCs/>
+        </w:rPr>
+      </w:pPr>
+      <w:r>
+        <w:rPr>
+          <w:b/>
+          <w:bCs/>
+        </w:rPr>
+        <w:t>Key Features</w:t>
+      </w:r>
+    </w:p>
+    <w:p>
+      <w:pPr>
+        <w:numPr>
+          <w:ilvl w:val="0"/>
+          <w:numId w:val="1"/>
+        </w:numPr>
+      </w:pPr>
+      <w:r>
+        <w:t xml:space="preserve">Accepts marks for </w:t>
+      </w:r>
+      <w:r>
+        <w:rPr>
+          <w:b/>
+          <w:bCs/>
+        </w:rPr>
+        <w:t>multiple subjects</w:t>
+      </w:r>
+      <w:r>
+        <w:t xml:space="preserve">. </w:t>
+      </w:r>
+    </w:p>
+    <w:p>
+      <w:pPr>
+        <w:numPr>
+          <w:ilvl w:val="0"/>
+          <w:numId w:val="1"/>
+        </w:numPr>
+      </w:pPr>
+      <w:r>
+        <w:t xml:space="preserve">Validates marks within the allowed range of </w:t>
+      </w:r>
+      <w:r>
+        <w:rPr>
+          <w:b/>
+          <w:bCs/>
+        </w:rPr>
+        <w:t>0–100</w:t>
+      </w:r>
+      <w:r>
+        <w:t xml:space="preserve">. </w:t>
+      </w:r>
+    </w:p>
+    <w:p>
+      <w:pPr>
+        <w:numPr>
+          <w:ilvl w:val="0"/>
+          <w:numId w:val="1"/>
+        </w:numPr>
+      </w:pPr>
+      <w:r>
+        <w:t xml:space="preserve">Calculates the </w:t>
+      </w:r>
+      <w:r>
+        <w:rPr>
+          <w:b/>
+          <w:bCs/>
+        </w:rPr>
+        <w:t>total marks</w:t>
+      </w:r>
+      <w:r>
+        <w:t xml:space="preserve"> obtained. </w:t>
+      </w:r>
+    </w:p>
+    <w:p>
+      <w:pPr>
+        <w:numPr>
+          <w:ilvl w:val="0"/>
+          <w:numId w:val="1"/>
+        </w:numPr>
+      </w:pPr>
+      <w:r>
+        <w:t xml:space="preserve">Calculates the </w:t>
+      </w:r>
+      <w:r>
+        <w:rPr>
+          <w:b/>
+          <w:bCs/>
+        </w:rPr>
+        <w:t>overall percentage</w:t>
+      </w:r>
+      <w:r>
+        <w:t xml:space="preserve">. </w:t>
+      </w:r>
+    </w:p>
+    <w:p>
+      <w:pPr>
+        <w:numPr>
+          <w:ilvl w:val="0"/>
+          <w:numId w:val="1"/>
+        </w:numPr>
+      </w:pPr>
+      <w:r>
+        <w:t xml:space="preserve">Assigns grades based on predefined conditions: </w:t>
+      </w:r>
+    </w:p>
+    <w:p>
+      <w:pPr>
+        <w:numPr>
+          <w:ilvl w:val="1"/>
+          <w:numId w:val="1"/>
+        </w:numPr>
+      </w:pPr>
+      <w:r>
+        <w:rPr>
+          <w:b/>
+          <w:bCs/>
+        </w:rPr>
+        <w:t>A+</w:t>
+      </w:r>
+      <w:r>
+        <w:t xml:space="preserve"> → 90% and above </w:t>
+      </w:r>
+    </w:p>
+    <w:p>
+      <w:pPr>
+        <w:numPr>
+          <w:ilvl w:val="1"/>
+          <w:numId w:val="1"/>
+        </w:numPr>
+      </w:pPr>
+      <w:r>
+        <w:rPr>
+          <w:b/>
+          <w:bCs/>
+        </w:rPr>
+        <w:t>A</w:t>
+      </w:r>
+      <w:r>
+        <w:t xml:space="preserve"> → 80–89% </w:t>
+      </w:r>
+    </w:p>
+    <w:p>
+      <w:pPr>
+        <w:numPr>
+          <w:ilvl w:val="1"/>
+          <w:numId w:val="1"/>
+        </w:numPr>
+      </w:pPr>
+      <w:r>
+        <w:rPr>
+          <w:b/>
+          <w:bCs/>
+        </w:rPr>
+        <w:t>B</w:t>
+      </w:r>
+      <w:r>
+        <w:t xml:space="preserve"> → 70–79% </w:t>
+      </w:r>
+    </w:p>
+    <w:p>
+      <w:pPr>
+        <w:numPr>
+          <w:ilvl w:val="1"/>
+          <w:numId w:val="1"/>
+        </w:numPr>
+      </w:pPr>
+      <w:r>
+        <w:rPr>
+          <w:b/>
+          <w:bCs/>
+        </w:rPr>
+        <w:t>C</w:t>
+      </w:r>
+      <w:r>
+        <w:t xml:space="preserve"> → 60–69% </w:t>
+      </w:r>
+    </w:p>
+    <w:p>
+      <w:pPr>
+        <w:numPr>
+          <w:ilvl w:val="1"/>
+          <w:numId w:val="1"/>
+        </w:numPr>
+      </w:pPr>
+      <w:r>
+        <w:rPr>
+          <w:b/>
+          <w:bCs/>
+        </w:rPr>
+        <w:t>D</w:t>
+      </w:r>
+      <w:r>
+        <w:t xml:space="preserve"> → 50–59% </w:t>
+      </w:r>
+    </w:p>
+    <w:p>
+      <w:pPr>
+        <w:numPr>
+          <w:ilvl w:val="1"/>
+          <w:numId w:val="1"/>
+        </w:numPr>
+      </w:pPr>
+      <w:r>
+        <w:rPr>
+          <w:b/>
+          <w:bCs/>
+        </w:rPr>
+        <w:t>E</w:t>
+      </w:r>
+      <w:r>
+        <w:t xml:space="preserve"> → 40–49% </w:t>
+      </w:r>
+    </w:p>
+    <w:p>
+      <w:pPr>
+        <w:numPr>
+          <w:ilvl w:val="1"/>
+          <w:numId w:val="1"/>
+        </w:numPr>
+      </w:pPr>
+      <w:r>
+        <w:rPr>
+          <w:b/>
+          <w:bCs/>
+        </w:rPr>
+        <w:t>F</w:t>
+      </w:r>
+      <w:r>
+        <w:t xml:space="preserve"> → Below 40% </w:t>
+      </w:r>
+    </w:p>
+    <w:p>
+      <w:pPr>
+        <w:numPr>
+          <w:ilvl w:val="0"/>
+          <w:numId w:val="1"/>
+        </w:numPr>
+      </w:pPr>
+      <w:r>
+        <w:t xml:space="preserve">Displays the student's </w:t>
+      </w:r>
+      <w:r>
+        <w:rPr>
+          <w:b/>
+          <w:bCs/>
+        </w:rPr>
+        <w:t>subject-wise marks</w:t>
+      </w:r>
+      <w:r>
+        <w:t xml:space="preserve">. </w:t>
+      </w:r>
+    </w:p>
+    <w:p>
+      <w:pPr>
+        <w:numPr>
+          <w:ilvl w:val="0"/>
+          <w:numId w:val="1"/>
+        </w:numPr>
+      </w:pPr>
+      <w:r>
+        <w:t xml:space="preserve">Displays the </w:t>
+      </w:r>
+      <w:r>
+        <w:rPr>
+          <w:b/>
+          <w:bCs/>
+        </w:rPr>
+        <w:t>total, percentage, grade, and performance</w:t>
+      </w:r>
+      <w:r>
+        <w:t xml:space="preserve">. </w:t>
+      </w:r>
+    </w:p>
+    <w:p>
+      <w:pPr>
+        <w:numPr>
+          <w:ilvl w:val="0"/>
+          <w:numId w:val="1"/>
+        </w:numPr>
+      </w:pPr>
+      <w:r>
+        <w:t xml:space="preserve">Shows whether the student has </w:t>
+      </w:r>
+      <w:r>
+        <w:rPr>
+          <w:b/>
+          <w:bCs/>
+        </w:rPr>
+        <w:t>passed or failed</w:t>
+      </w:r>
+      <w:r>
+        <w:t xml:space="preserve">. </w:t>
+      </w:r>
+    </w:p>
+    <w:p>
+      <w:pPr>
+        <w:numPr>
+          <w:ilvl w:val="0"/>
+          <w:numId w:val="1"/>
+        </w:numPr>
+      </w:pPr>
+      <w:r>
+        <w:t xml:space="preserve">Provides an interactive web interface using Streamlit. </w:t>
+      </w:r>
+    </w:p>
+    <w:p>
+      <w:pPr>
+        <w:numPr>
+          <w:ilvl w:val="0"/>
+          <w:numId w:val="1"/>
+        </w:numPr>
+      </w:pPr>
+      <w:r>
+        <w:t xml:space="preserve">Can be executed locally using </w:t>
+      </w:r>
+      <w:r>
+        <w:rPr>
+          <w:b/>
+          <w:bCs/>
+        </w:rPr>
+        <w:t>localhost</w:t>
+      </w:r>
+      <w:r>
+        <w:t xml:space="preserve">. </w:t>
+      </w:r>
+    </w:p>
+    <w:p>
+      <w:pPr>
+        <w:rPr>
+          <w:b/>
+          <w:bCs/>
+        </w:rPr>
+      </w:pPr>
+      <w:r>
+        <w:rPr>
+          <w:b/>
+          <w:bCs/>
+        </w:rPr>
+        <w:t>Technologies Used</w:t>
+      </w:r>
+    </w:p>
+    <w:p>
+      <w:pPr>
+        <w:numPr>
+          <w:ilvl w:val="0"/>
+          <w:numId w:val="2"/>
+        </w:numPr>
+      </w:pPr>
+      <w:r>
+        <w:rPr>
+          <w:b/>
+          <w:bCs/>
+        </w:rPr>
+        <w:t>Python</w:t>
+      </w:r>
+      <w:r>
+        <w:t xml:space="preserve"> – Main programming language used to develop the grade calculator. </w:t>
+      </w:r>
+    </w:p>
+    <w:p>
+      <w:pPr>
+        <w:numPr>
+          <w:ilvl w:val="0"/>
+          <w:numId w:val="2"/>
+        </w:numPr>
+      </w:pPr>
+      <w:r>
+        <w:rPr>
+          <w:b/>
+          <w:bCs/>
+        </w:rPr>
+        <w:t>Streamlit</w:t>
+      </w:r>
+      <w:r>
+        <w:t xml:space="preserve"> – Used to create the interactive web-based interface. </w:t>
+      </w:r>
+    </w:p>
+    <w:p>
+      <w:pPr>
+        <w:numPr>
+          <w:ilvl w:val="0"/>
+          <w:numId w:val="2"/>
+        </w:numPr>
+      </w:pPr>
+      <w:r>
+        <w:rPr>
+          <w:b/>
+          <w:bCs/>
+        </w:rPr>
+        <w:lastRenderedPageBreak/>
+        <w:t>Conditional Statements (if, elif, else)</w:t>
+      </w:r>
+      <w:r>
+        <w:t xml:space="preserve"> – Used to assign grades based on percentage. </w:t>
+      </w:r>
+    </w:p>
+    <w:p>
+      <w:pPr>
+        <w:numPr>
+          <w:ilvl w:val="0"/>
+          <w:numId w:val="2"/>
+        </w:numPr>
+      </w:pPr>
+      <w:r>
+        <w:rPr>
+          <w:b/>
+          <w:bCs/>
+        </w:rPr>
+        <w:t>Arithmetic Operations</w:t>
+      </w:r>
+      <w:r>
+        <w:t xml:space="preserve"> – Used to calculate total marks and percentage. </w:t>
+      </w:r>
+    </w:p>
+    <w:p>
+      <w:pPr>
+        <w:numPr>
+          <w:ilvl w:val="0"/>
+          <w:numId w:val="2"/>
+        </w:numPr>
+      </w:pPr>
+      <w:r>
+        <w:rPr>
+          <w:b/>
+          <w:bCs/>
+        </w:rPr>
+        <w:t>Input Validation</w:t>
+      </w:r>
+      <w:r>
+        <w:t xml:space="preserve"> – Used to ensure that marks are within the valid range. </w:t>
+      </w:r>
+    </w:p>
+    <w:p>
+      <w:pPr>
+        <w:numPr>
+          <w:ilvl w:val="0"/>
+          <w:numId w:val="2"/>
+        </w:numPr>
+      </w:pPr>
+      <w:r>
+        <w:rPr>
+          <w:b/>
+          <w:bCs/>
+        </w:rPr>
+        <w:t>Git &amp; GitHub</w:t>
+      </w:r>
+      <w:r>
+        <w:t xml:space="preserve"> – Used for version control and project submission. </w:t>
+      </w:r>
+    </w:p>
+    <w:p>
+      <w:pPr>
+        <w:numPr>
+          <w:ilvl w:val="0"/>
+          <w:numId w:val="2"/>
+        </w:numPr>
+      </w:pPr>
+      <w:r>
+        <w:rPr>
+          <w:b/>
+          <w:bCs/>
+        </w:rPr>
+        <w:t>Localhost</w:t>
+      </w:r>
+      <w:r>
+        <w:t xml:space="preserve"> – Used to run and test the Streamlit application locally. </w:t>
+      </w:r>
+      <w:r>
+        <w:rPr>
+          <w:noProof/>
+        </w:rPr>
+        <w:drawing>
+          <wp:inline distT="0" distB="0" distL="0" distR="0" wp14:anchorId="1BF92D2E" wp14:editId="1F5E478C">
+            <wp:extent cx="4466592" cy="4067175"/>
+            <wp:effectExtent l="0" t="0" r="0" b="0"/>
+            <wp:docPr id="2050102097" name="Picture 2"/>
+            <wp:cNvGraphicFramePr>
+              <a:graphicFrameLocks xmlns:a="http://schemas.openxmlformats.org/drawingml/2006/main" noChangeAspect="1"/>
+            </wp:cNvGraphicFramePr>
+            <a:graphic xmlns:a="http://schemas.openxmlformats.org/drawingml/2006/main">
+              <a:graphicData uri="http://schemas.openxmlformats.org/drawingml/2006/picture">
+                <pic:pic xmlns:pic="http://schemas.openxmlformats.org/drawingml/2006/picture">
+                  <pic:nvPicPr>
+                    <pic:cNvPr id="0" name="Picture 2"/>
+                    <pic:cNvPicPr>
+                      <a:picLocks noChangeAspect="1" noChangeArrowheads="1"/>
+                    </pic:cNvPicPr>
+                  </pic:nvPicPr>
+                  <pic:blipFill>
+                    <a:blip r:embed="rId5" cstate="print">
+                      <a:extLst>
+                        <a:ext uri="{28A0092B-C50C-407E-A947-70E740481C1C}">
+                          <a14:useLocalDpi xmlns:a14="http://schemas.microsoft.com/office/drawing/2010/main" val="0"/>
+                        </a:ext>
+                      </a:extLst>
+                    </a:blip>
+                    <a:srcRect/>
+                    <a:stretch>
+                      <a:fillRect/>
+                    </a:stretch>
+                  </pic:blipFill>
+                  <pic:spPr bwMode="auto">
+                    <a:xfrm>
+                      <a:off x="0" y="0"/>
+                      <a:ext cx="4499952" cy="4097552"/>
+                    </a:xfrm>
+                    <a:prstGeom prst="rect">
+                      <a:avLst/>
+                    </a:prstGeom>
+                    <a:noFill/>
+                    <a:ln>
+                      <a:noFill/>
+                    </a:ln>
+                  </pic:spPr>
+                </pic:pic>
+              </a:graphicData>
+            </a:graphic>
+          </wp:inline>
+        </w:drawing>
+      </w:r>
+    </w:p>
+    <w:p>
+      <w:pPr>
+        <w:ind w:left="360"/>
+      </w:pPr>
+      <w:r>
+        <w:rPr>
+          <w:noProof/>
+        </w:rPr>
+        <w:lastRenderedPageBreak/>
+        <w:drawing>
+          <wp:inline distT="0" distB="0" distL="0" distR="0" wp14:anchorId="0DA66A15" wp14:editId="0FC54E6C">
+            <wp:extent cx="3171649" cy="4627796"/>
+            <wp:effectExtent l="0" t="0" r="0" b="1905"/>
+            <wp:docPr id="1936852659" name="Picture 3"/>
+            <wp:cNvGraphicFramePr>
+              <a:graphicFrameLocks xmlns:a="http://schemas.openxmlformats.org/drawingml/2006/main" noChangeAspect="1"/>
+            </wp:cNvGraphicFramePr>
+            <a:graphic xmlns:a="http://schemas.openxmlformats.org/drawingml/2006/main">
+              <a:graphicData uri="http://schemas.openxmlformats.org/drawingml/2006/picture">
+                <pic:pic xmlns:pic="http://schemas.openxmlformats.org/drawingml/2006/picture">
+                  <pic:nvPicPr>
+                    <pic:cNvPr id="0" name="Picture 3"/>
+                    <pic:cNvPicPr>
+                      <a:picLocks noChangeAspect="1" noChangeArrowheads="1"/>
+                    </pic:cNvPicPr>
+                  </pic:nvPicPr>
+                  <pic:blipFill>
+                    <a:blip r:embed="rId6" cstate="print">
+                      <a:extLst>
+                        <a:ext uri="{28A0092B-C50C-407E-A947-70E740481C1C}">
+                          <a14:useLocalDpi xmlns:a14="http://schemas.microsoft.com/office/drawing/2010/main" val="0"/>
+                        </a:ext>
+                      </a:extLst>
+                    </a:blip>
+                    <a:srcRect/>
+                    <a:stretch>
+                      <a:fillRect/>
+                    </a:stretch>
+                  </pic:blipFill>
+                  <pic:spPr bwMode="auto">
+                    <a:xfrm>
+                      <a:off x="0" y="0"/>
+                      <a:ext cx="3193260" cy="4659329"/>
+                    </a:xfrm>
+                    <a:prstGeom prst="rect">
+                      <a:avLst/>
+                    </a:prstGeom>
+                    <a:noFill/>
+                    <a:ln>
+                      <a:noFill/>
+                    </a:ln>
+                  </pic:spPr>
+                </pic:pic>
+              </a:graphicData>
+            </a:graphic>
+          </wp:inline>
+        </w:drawing>
+      </w:r>
+    </w:p>
+    <w:p>
+      <w:pPr>
+        <w:rPr>
+          <w:noProof/>
+        </w:rPr>
+      </w:pPr>
+      <w:r>
+        <w:rPr>
+          <w:noProof/>
+        </w:rPr>
+        <w:drawing>
+          <wp:inline distT="0" distB="0" distL="0" distR="0" wp14:anchorId="362F09C1" wp14:editId="6B61534B">
+            <wp:extent cx="2026344" cy="2270125"/>
+            <wp:effectExtent l="0" t="0" r="0" b="0"/>
+            <wp:docPr id="5658444" name="Picture 4"/>
+            <wp:cNvGraphicFramePr>
+              <a:graphicFrameLocks xmlns:a="http://schemas.openxmlformats.org/drawingml/2006/main" noChangeAspect="1"/>
+            </wp:cNvGraphicFramePr>
+            <a:graphic xmlns:a="http://schemas.openxmlformats.org/drawingml/2006/main">
+              <a:graphicData uri="http://schemas.openxmlformats.org/drawingml/2006/picture">
+                <pic:pic xmlns:pic="http://schemas.openxmlformats.org/drawingml/2006/picture">
+                  <pic:nvPicPr>
+                    <pic:cNvPr id="0" name="Picture 4"/>
+                    <pic:cNvPicPr>
+                      <a:picLocks noChangeAspect="1" noChangeArrowheads="1"/>
+                    </pic:cNvPicPr>
+                  </pic:nvPicPr>
+                  <pic:blipFill>
+                    <a:blip r:embed="rId7" cstate="print">
+                      <a:extLst>
+                        <a:ext uri="{28A0092B-C50C-407E-A947-70E740481C1C}">
+                          <a14:useLocalDpi xmlns:a14="http://schemas.microsoft.com/office/drawing/2010/main" val="0"/>
+                        </a:ext>
+                      </a:extLst>
+                    </a:blip>
+                    <a:srcRect/>
+                    <a:stretch>
+                      <a:fillRect/>
+                    </a:stretch>
+                  </pic:blipFill>
+                  <pic:spPr bwMode="auto">
+                    <a:xfrm>
+                      <a:off x="0" y="0"/>
+                      <a:ext cx="2059764" cy="2307566"/>
+                    </a:xfrm>
+                    <a:prstGeom prst="rect">
+                      <a:avLst/>
+                    </a:prstGeom>
+                    <a:noFill/>
+                    <a:ln>
+                      <a:noFill/>
+                    </a:ln>
+                  </pic:spPr>
+                </pic:pic>
+              </a:graphicData>
+            </a:graphic>
+          </wp:inline>
+        </w:drawing>
+      </w:r>
+      <w:r>
+        <w:rPr>
+          <w:noProof/>
+        </w:rPr>
+        <w:t xml:space="preserve">    </w:t>
+      </w:r>
+      <w:r>
+        <w:rPr>
+          <w:noProof/>
+        </w:rPr>
+        <w:drawing>
+          <wp:inline distT="0" distB="0" distL="0" distR="0" wp14:anchorId="75585C71" wp14:editId="13382147">
+            <wp:extent cx="3295540" cy="1345327"/>
+            <wp:effectExtent l="0" t="0" r="635" b="7620"/>
+            <wp:docPr id="871944502" name="Picture 1"/>
+            <wp:cNvGraphicFramePr>
+              <a:graphicFrameLocks xmlns:a="http://schemas.openxmlformats.org/drawingml/2006/main" noChangeAspect="1"/>
+            </wp:cNvGraphicFramePr>
+            <a:graphic xmlns:a="http://schemas.openxmlformats.org/drawingml/2006/main">
+              <a:graphicData uri="http://schemas.openxmlformats.org/drawingml/2006/picture">
+                <pic:pic xmlns:pic="http://schemas.openxmlformats.org/drawingml/2006/picture">
+                  <pic:nvPicPr>
+                    <pic:cNvPr id="0" name="Picture 1"/>
+                    <pic:cNvPicPr>
+                      <a:picLocks noChangeAspect="1" noChangeArrowheads="1"/>
+                    </pic:cNvPicPr>
+                  </pic:nvPicPr>
+                  <pic:blipFill>
+                    <a:blip r:embed="rId8" cstate="print">
+                      <a:extLst>
+                        <a:ext uri="{28A0092B-C50C-407E-A947-70E740481C1C}">
+                          <a14:useLocalDpi xmlns:a14="http://schemas.microsoft.com/office/drawing/2010/main" val="0"/>
+                        </a:ext>
+                      </a:extLst>
+                    </a:blip>
+                    <a:srcRect/>
+                    <a:stretch>
+                      <a:fillRect/>
+                    </a:stretch>
+                  </pic:blipFill>
+                  <pic:spPr bwMode="auto">
+                    <a:xfrm>
+                      <a:off x="0" y="0"/>
+                      <a:ext cx="3301242" cy="1347655"/>
+                    </a:xfrm>
+                    <a:prstGeom prst="rect">
+                      <a:avLst/>
+                    </a:prstGeom>
+                    <a:noFill/>
+                    <a:ln>
+                      <a:noFill/>
+                    </a:ln>
+                  </pic:spPr>
+                </pic:pic>
+              </a:graphicData>
+            </a:graphic>
+          </wp:inline>
+        </w:drawing>
+      </w:r>
+    </w:p>
     <w:p/>
+    <w:p/>
+    <w:p/>
+    <w:p>
+      <w:r>
+        <w:lastRenderedPageBreak/>
+        <w:t>OUTPUT :</w:t>
+      </w:r>
+      <w:r>
+        <w:t xml:space="preserve"> </w:t>
+      </w:r>
+      <w:r>
+        <w:t>http://192.168.1.4:8501</w:t>
+      </w:r>
+    </w:p>
+    <w:p>
+      <w:r>
+        <w:rPr>
+          <w:noProof/>
+        </w:rPr>
+        <w:drawing>
+          <wp:inline distT="0" distB="0" distL="0" distR="0" wp14:anchorId="77750018" wp14:editId="535F89D9">
+            <wp:extent cx="2759376" cy="2462212"/>
+            <wp:effectExtent l="0" t="0" r="3175" b="0"/>
+            <wp:docPr id="1405395466" name="Picture 8"/>
+            <wp:cNvGraphicFramePr>
+              <a:graphicFrameLocks xmlns:a="http://schemas.openxmlformats.org/drawingml/2006/main" noChangeAspect="1"/>
+            </wp:cNvGraphicFramePr>
+            <a:graphic xmlns:a="http://schemas.openxmlformats.org/drawingml/2006/main">
+              <a:graphicData uri="http://schemas.openxmlformats.org/drawingml/2006/picture">
+                <pic:pic xmlns:pic="http://schemas.openxmlformats.org/drawingml/2006/picture">
+                  <pic:nvPicPr>
+                    <pic:cNvPr id="0" name="Picture 24"/>
+                    <pic:cNvPicPr>
+                      <a:picLocks noChangeAspect="1" noChangeArrowheads="1"/>
+                    </pic:cNvPicPr>
+                  </pic:nvPicPr>
+                  <pic:blipFill>
+                    <a:blip r:embed="rId9" cstate="print">
+                      <a:extLst>
+                        <a:ext uri="{28A0092B-C50C-407E-A947-70E740481C1C}">
+                          <a14:useLocalDpi xmlns:a14="http://schemas.microsoft.com/office/drawing/2010/main" val="0"/>
+                        </a:ext>
+                      </a:extLst>
+                    </a:blip>
+                    <a:srcRect/>
+                    <a:stretch>
+                      <a:fillRect/>
+                    </a:stretch>
+                  </pic:blipFill>
+                  <pic:spPr bwMode="auto">
+                    <a:xfrm>
+                      <a:off x="0" y="0"/>
+                      <a:ext cx="2771899" cy="2473386"/>
+                    </a:xfrm>
+                    <a:prstGeom prst="rect">
+                      <a:avLst/>
+                    </a:prstGeom>
+                    <a:noFill/>
+                    <a:ln>
+                      <a:noFill/>
+                    </a:ln>
+                  </pic:spPr>
+                </pic:pic>
+              </a:graphicData>
+            </a:graphic>
+          </wp:inline>
+        </w:drawing>
+      </w:r>
+    </w:p>
+    <w:p>
+      <w:r>
+        <w:rPr>
+          <w:noProof/>
+        </w:rPr>
+        <w:drawing>
+          <wp:inline distT="0" distB="0" distL="0" distR="0" wp14:anchorId="2CAD44BE" wp14:editId="6E1FC1ED">
+            <wp:extent cx="2667000" cy="2161523"/>
+            <wp:effectExtent l="0" t="0" r="0" b="0"/>
+            <wp:docPr id="901788952" name="Picture 9"/>
+            <wp:cNvGraphicFramePr>
+              <a:graphicFrameLocks xmlns:a="http://schemas.openxmlformats.org/drawingml/2006/main" noChangeAspect="1"/>
+            </wp:cNvGraphicFramePr>
+            <a:graphic xmlns:a="http://schemas.openxmlformats.org/drawingml/2006/main">
+              <a:graphicData uri="http://schemas.openxmlformats.org/drawingml/2006/picture">
+                <pic:pic xmlns:pic="http://schemas.openxmlformats.org/drawingml/2006/picture">
+                  <pic:nvPicPr>
+                    <pic:cNvPr id="0" name="Picture 26"/>
+                    <pic:cNvPicPr>
+                      <a:picLocks noChangeAspect="1" noChangeArrowheads="1"/>
+                    </pic:cNvPicPr>
+                  </pic:nvPicPr>
+                  <pic:blipFill>
+                    <a:blip r:embed="rId10" cstate="print">
+                      <a:extLst>
+                        <a:ext uri="{28A0092B-C50C-407E-A947-70E740481C1C}">
+                          <a14:useLocalDpi xmlns:a14="http://schemas.microsoft.com/office/drawing/2010/main" val="0"/>
+                        </a:ext>
+                      </a:extLst>
+                    </a:blip>
+                    <a:srcRect/>
+                    <a:stretch>
+                      <a:fillRect/>
+                    </a:stretch>
+                  </pic:blipFill>
+                  <pic:spPr bwMode="auto">
+                    <a:xfrm>
+                      <a:off x="0" y="0"/>
+                      <a:ext cx="2674856" cy="2167890"/>
+                    </a:xfrm>
+                    <a:prstGeom prst="rect">
+                      <a:avLst/>
+                    </a:prstGeom>
+                    <a:noFill/>
+                    <a:ln>
+                      <a:noFill/>
+                    </a:ln>
+                  </pic:spPr>
+                </pic:pic>
+              </a:graphicData>
+            </a:graphic>
+          </wp:inline>
+        </w:drawing>
+      </w:r>
+    </w:p>
+    <w:p>
+      <w:r>
+        <w:rPr>
+          <w:noProof/>
+        </w:rPr>
+        <w:drawing>
+          <wp:inline distT="0" distB="0" distL="0" distR="0" wp14:anchorId="0F20B426" wp14:editId="443112C6">
+            <wp:extent cx="3215005" cy="2324100"/>
+            <wp:effectExtent l="0" t="0" r="4445" b="0"/>
+            <wp:docPr id="935133545" name="Picture 10"/>
+            <wp:cNvGraphicFramePr>
+              <a:graphicFrameLocks xmlns:a="http://schemas.openxmlformats.org/drawingml/2006/main" noChangeAspect="1"/>
+            </wp:cNvGraphicFramePr>
+            <a:graphic xmlns:a="http://schemas.openxmlformats.org/drawingml/2006/main">
+              <a:graphicData uri="http://schemas.openxmlformats.org/drawingml/2006/picture">
+                <pic:pic xmlns:pic="http://schemas.openxmlformats.org/drawingml/2006/picture">
+                  <pic:nvPicPr>
+                    <pic:cNvPr id="0" name="Picture 28"/>
+                    <pic:cNvPicPr>
+                      <a:picLocks noChangeAspect="1" noChangeArrowheads="1"/>
+                    </pic:cNvPicPr>
+                  </pic:nvPicPr>
+                  <pic:blipFill>
+                    <a:blip r:embed="rId11">
+                      <a:extLst>
+                        <a:ext uri="{28A0092B-C50C-407E-A947-70E740481C1C}">
+                          <a14:useLocalDpi xmlns:a14="http://schemas.microsoft.com/office/drawing/2010/main" val="0"/>
+                        </a:ext>
+                      </a:extLst>
+                    </a:blip>
+                    <a:srcRect/>
+                    <a:stretch>
+                      <a:fillRect/>
+                    </a:stretch>
+                  </pic:blipFill>
+                  <pic:spPr bwMode="auto">
+                    <a:xfrm>
+                      <a:off x="0" y="0"/>
+                      <a:ext cx="3215005" cy="2324100"/>
+                    </a:xfrm>
+                    <a:prstGeom prst="rect">
+                      <a:avLst/>
+                    </a:prstGeom>
+                    <a:noFill/>
+                    <a:ln>
+                      <a:noFill/>
+                    </a:ln>
+                  </pic:spPr>
+                </pic:pic>
+              </a:graphicData>
+            </a:graphic>
+          </wp:inline>
+        </w:drawing>
+      </w:r>
+    </w:p>
+    <w:p/>
+    <w:p/>
+    <w:p>
+      <w:r>
+        <w:lastRenderedPageBreak/>
+        <w:t>Github:</w:t>
+      </w:r>
+      <w:r>
+        <w:t xml:space="preserve"> </w:t>
+      </w:r>
+      <w:r>
+        <w:t>https://github.com/shambhavi0804/VEDA-internship/commit/3e808d0cfc5ca670ea440104b2b7d7640e4a3c7f</w:t>
+      </w:r>
+    </w:p>
+    <w:p>
+      <w:r>
+        <w:drawing>
+          <wp:inline distT="0" distB="0" distL="0" distR="0" wp14:anchorId="0BF0905D" wp14:editId="012D0E42">
+            <wp:extent cx="5943600" cy="3193415"/>
+            <wp:effectExtent l="0" t="0" r="0" b="6985"/>
+            <wp:docPr id="163716836" name="Picture 1"/>
+            <wp:cNvGraphicFramePr>
+              <a:graphicFrameLocks xmlns:a="http://schemas.openxmlformats.org/drawingml/2006/main" noChangeAspect="1"/>
+            </wp:cNvGraphicFramePr>
+            <a:graphic xmlns:a="http://schemas.openxmlformats.org/drawingml/2006/main">
+              <a:graphicData uri="http://schemas.openxmlformats.org/drawingml/2006/picture">
+                <pic:pic xmlns:pic="http://schemas.openxmlformats.org/drawingml/2006/picture">
+                  <pic:nvPicPr>
+                    <pic:cNvPr id="163716836" name=""/>
+                    <pic:cNvPicPr/>
+                  </pic:nvPicPr>
+                  <pic:blipFill>
+                    <a:blip r:embed="rId12"/>
+                    <a:stretch>
+                      <a:fillRect/>
+                    </a:stretch>
+                  </pic:blipFill>
+                  <pic:spPr>
+                    <a:xfrm>
+                      <a:off x="0" y="0"/>
+                      <a:ext cx="5943600" cy="3193415"/>
+                    </a:xfrm>
+                    <a:prstGeom prst="rect">
+                      <a:avLst/>
+                    </a:prstGeom>
+                  </pic:spPr>
+                </pic:pic>
+              </a:graphicData>
+            </a:graphic>
+          </wp:inline>
+        </w:drawing>
+      </w:r>
+      <w:r>
+        <w:br/>
+      </w:r>
+    </w:p>
+    <w:p>
+      <w:r>
+        <w:t>https://lnkd.in/p/dn_dCeZb</w:t>
+      </w:r>
+      <w:r>
+        <w:br/>
+      </w:r>
+      <w:r>
+        <w:drawing>
+          <wp:inline distT="0" distB="0" distL="0" distR="0" wp14:anchorId="5004D18A" wp14:editId="0A169846">
+            <wp:extent cx="5943600" cy="2900680"/>
+            <wp:effectExtent l="0" t="0" r="0" b="0"/>
+            <wp:docPr id="1197889407" name="Picture 1"/>
+            <wp:cNvGraphicFramePr>
+              <a:graphicFrameLocks xmlns:a="http://schemas.openxmlformats.org/drawingml/2006/main" noChangeAspect="1"/>
+            </wp:cNvGraphicFramePr>
+            <a:graphic xmlns:a="http://schemas.openxmlformats.org/drawingml/2006/main">
+              <a:graphicData uri="http://schemas.openxmlformats.org/drawingml/2006/picture">
+                <pic:pic xmlns:pic="http://schemas.openxmlformats.org/drawingml/2006/picture">
+                  <pic:nvPicPr>
+                    <pic:cNvPr id="1197889407" name=""/>
+                    <pic:cNvPicPr/>
+                  </pic:nvPicPr>
+                  <pic:blipFill>
+                    <a:blip r:embed="rId13"/>
+                    <a:stretch>
+                      <a:fillRect/>
+                    </a:stretch>
+                  </pic:blipFill>
+                  <pic:spPr>
+                    <a:xfrm>
+                      <a:off x="0" y="0"/>
+                      <a:ext cx="5943600" cy="2900680"/>
+                    </a:xfrm>
+                    <a:prstGeom prst="rect">
+                      <a:avLst/>
+                    </a:prstGeom>
+                  </pic:spPr>
+                </pic:pic>
+              </a:graphicData>
+            </a:graphic>
+          </wp:inline>
+        </w:drawing>
+      </w:r>
+    </w:p>
     <w:sectPr>
       <w:pgSz w:w="12240" w:h="15840"/>
       <w:pgMar w:top="1440" w:right="1440" w:bottom="1440" w:left="1440" w:header="720" w:footer="720" w:gutter="0"/>
@@ -11,6 +1035,315 @@
     </w:sectPr>
   </w:body>
 </w:document>
+</file>
+
+<file path=word/numbering.xml><?xml version="1.0" encoding="utf-8"?>
+<w:numbering xmlns:wpc="http://schemas.microsoft.com/office/word/2010/wordprocessingCanvas" xmlns:cx="http://schemas.microsoft.com/office/drawing/2014/chartex" xmlns:cx1="http://schemas.microsoft.com/office/drawing/2015/9/8/chartex" xmlns:cx2="http://schemas.microsoft.com/office/drawing/2015/10/21/chartex" xmlns:cx3="http://schemas.microsoft.com/office/drawing/2016/5/9/chartex" xmlns:cx4="http://schemas.microsoft.com/office/drawing/2016/5/10/chartex" xmlns:cx5="http://schemas.microsoft.com/office/drawing/2016/5/11/chartex" xmlns:cx6="http://schemas.microsoft.com/office/drawing/2016/5/12/chartex" xmlns:cx7="http://schemas.microsoft.com/office/drawing/2016/5/13/chartex" xmlns:cx8="http://schemas.microsoft.com/office/drawing/2016/5/14/chartex" xmlns:mc="http://schemas.openxmlformats.org/markup-compatibility/2006" xmlns:aink="http://schemas.microsoft.com/office/drawing/2016/ink" xmlns:am3d="http://schemas.microsoft.com/office/drawing/2017/model3d" xmlns:o="urn:schemas-microsoft-com:office:office" xmlns:oel="http://schemas.microsoft.com/office/2019/extlst" xmlns:r="http://schemas.openxmlformats.org/officeDocument/2006/relationships" xmlns:m="http://schemas.openxmlformats.org/officeDocument/2006/math" xmlns:v="urn:schemas-microsoft-com:vml" xmlns:wp14="http://schemas.microsoft.com/office/word/2010/wordprocessingDrawing" xmlns:wp="http://schemas.openxmlformats.org/drawingml/2006/wordprocessingDrawing" xmlns:w10="urn:schemas-microsoft-com:office:word" xmlns:w="http://schemas.openxmlformats.org/wordprocessingml/2006/main" xmlns:w14="http://schemas.microsoft.com/office/word/2010/wordml" xmlns:w15="http://schemas.microsoft.com/office/word/2012/wordml" xmlns:w16cex="http://schemas.microsoft.com/office/word/2018/wordml/cex" xmlns:w16cid="http://schemas.microsoft.com/office/word/2016/wordml/cid" xmlns:w16="http://schemas.microsoft.com/office/word/2018/wordml" xmlns:w16du="http://schemas.microsoft.com/office/word/2023/wordml/word16du" xmlns:w16sdtdh="http://schemas.microsoft.com/office/word/2020/wordml/sdtdatahash" xmlns:w16sdtfl="http://schemas.microsoft.com/office/word/2024/wordml/sdtformatlock" xmlns:w16se="http://schemas.microsoft.com/office/word/2015/wordml/symex" xmlns:wpg="http://schemas.microsoft.com/office/word/2010/wordprocessingGroup" xmlns:wpi="http://schemas.microsoft.com/office/word/2010/wordprocessingInk" xmlns:wne="http://schemas.microsoft.com/office/word/2006/wordml" xmlns:wps="http://schemas.microsoft.com/office/word/2010/wordprocessingShape" mc:Ignorable="w14 w15 w16se w16cid w16 w16cex w16sdtdh w16sdtfl w16du wp14">
+  <w:abstractNum w:abstractNumId="0" w15:restartNumberingAfterBreak="0">
+    <w:nsid w:val="244F192E"/>
+    <w:multiLevelType w:val="multilevel"/>
+    <w:tmpl w:val="702EFE68"/>
+    <w:lvl w:ilvl="0">
+      <w:start w:val="1"/>
+      <w:numFmt w:val="bullet"/>
+      <w:lvlText w:val=""/>
+      <w:lvlJc w:val="left"/>
+      <w:pPr>
+        <w:tabs>
+          <w:tab w:val="num" w:pos="720"/>
+        </w:tabs>
+        <w:ind w:left="720" w:hanging="360"/>
+      </w:pPr>
+      <w:rPr>
+        <w:rFonts w:ascii="Symbol" w:hAnsi="Symbol" w:hint="default"/>
+        <w:sz w:val="20"/>
+      </w:rPr>
+    </w:lvl>
+    <w:lvl w:ilvl="1">
+      <w:start w:val="1"/>
+      <w:numFmt w:val="bullet"/>
+      <w:lvlText w:val="o"/>
+      <w:lvlJc w:val="left"/>
+      <w:pPr>
+        <w:tabs>
+          <w:tab w:val="num" w:pos="1440"/>
+        </w:tabs>
+        <w:ind w:left="1440" w:hanging="360"/>
+      </w:pPr>
+      <w:rPr>
+        <w:rFonts w:ascii="Courier New" w:hAnsi="Courier New" w:hint="default"/>
+        <w:sz w:val="20"/>
+      </w:rPr>
+    </w:lvl>
+    <w:lvl w:ilvl="2" w:tentative="1">
+      <w:start w:val="1"/>
+      <w:numFmt w:val="bullet"/>
+      <w:lvlText w:val=""/>
+      <w:lvlJc w:val="left"/>
+      <w:pPr>
+        <w:tabs>
+          <w:tab w:val="num" w:pos="2160"/>
+        </w:tabs>
+        <w:ind w:left="2160" w:hanging="360"/>
+      </w:pPr>
+      <w:rPr>
+        <w:rFonts w:ascii="Wingdings" w:hAnsi="Wingdings" w:hint="default"/>
+        <w:sz w:val="20"/>
+      </w:rPr>
+    </w:lvl>
+    <w:lvl w:ilvl="3" w:tentative="1">
+      <w:start w:val="1"/>
+      <w:numFmt w:val="bullet"/>
+      <w:lvlText w:val=""/>
+      <w:lvlJc w:val="left"/>
+      <w:pPr>
+        <w:tabs>
+          <w:tab w:val="num" w:pos="2880"/>
+        </w:tabs>
+        <w:ind w:left="2880" w:hanging="360"/>
+      </w:pPr>
+      <w:rPr>
+        <w:rFonts w:ascii="Wingdings" w:hAnsi="Wingdings" w:hint="default"/>
+        <w:sz w:val="20"/>
+      </w:rPr>
+    </w:lvl>
+    <w:lvl w:ilvl="4" w:tentative="1">
+      <w:start w:val="1"/>
+      <w:numFmt w:val="bullet"/>
+      <w:lvlText w:val=""/>
+      <w:lvlJc w:val="left"/>
+      <w:pPr>
+        <w:tabs>
+          <w:tab w:val="num" w:pos="3600"/>
+        </w:tabs>
+        <w:ind w:left="3600" w:hanging="360"/>
+      </w:pPr>
+      <w:rPr>
+        <w:rFonts w:ascii="Wingdings" w:hAnsi="Wingdings" w:hint="default"/>
+        <w:sz w:val="20"/>
+      </w:rPr>
+    </w:lvl>
+    <w:lvl w:ilvl="5" w:tentative="1">
+      <w:start w:val="1"/>
+      <w:numFmt w:val="bullet"/>
+      <w:lvlText w:val=""/>
+      <w:lvlJc w:val="left"/>
+      <w:pPr>
+        <w:tabs>
+          <w:tab w:val="num" w:pos="4320"/>
+        </w:tabs>
+        <w:ind w:left="4320" w:hanging="360"/>
+      </w:pPr>
+      <w:rPr>
+        <w:rFonts w:ascii="Wingdings" w:hAnsi="Wingdings" w:hint="default"/>
+        <w:sz w:val="20"/>
+      </w:rPr>
+    </w:lvl>
+    <w:lvl w:ilvl="6" w:tentative="1">
+      <w:start w:val="1"/>
+      <w:numFmt w:val="bullet"/>
+      <w:lvlText w:val=""/>
+      <w:lvlJc w:val="left"/>
+      <w:pPr>
+        <w:tabs>
+          <w:tab w:val="num" w:pos="5040"/>
+        </w:tabs>
+        <w:ind w:left="5040" w:hanging="360"/>
+      </w:pPr>
+      <w:rPr>
+        <w:rFonts w:ascii="Wingdings" w:hAnsi="Wingdings" w:hint="default"/>
+        <w:sz w:val="20"/>
+      </w:rPr>
+    </w:lvl>
+    <w:lvl w:ilvl="7" w:tentative="1">
+      <w:start w:val="1"/>
+      <w:numFmt w:val="bullet"/>
+      <w:lvlText w:val=""/>
+      <w:lvlJc w:val="left"/>
+      <w:pPr>
+        <w:tabs>
+          <w:tab w:val="num" w:pos="5760"/>
+        </w:tabs>
+        <w:ind w:left="5760" w:hanging="360"/>
+      </w:pPr>
+      <w:rPr>
+        <w:rFonts w:ascii="Wingdings" w:hAnsi="Wingdings" w:hint="default"/>
+        <w:sz w:val="20"/>
+      </w:rPr>
+    </w:lvl>
+    <w:lvl w:ilvl="8" w:tentative="1">
+      <w:start w:val="1"/>
+      <w:numFmt w:val="bullet"/>
+      <w:lvlText w:val=""/>
+      <w:lvlJc w:val="left"/>
+      <w:pPr>
+        <w:tabs>
+          <w:tab w:val="num" w:pos="6480"/>
+        </w:tabs>
+        <w:ind w:left="6480" w:hanging="360"/>
+      </w:pPr>
+      <w:rPr>
+        <w:rFonts w:ascii="Wingdings" w:hAnsi="Wingdings" w:hint="default"/>
+        <w:sz w:val="20"/>
+      </w:rPr>
+    </w:lvl>
+  </w:abstractNum>
+  <w:abstractNum w:abstractNumId="1" w15:restartNumberingAfterBreak="0">
+    <w:nsid w:val="6FAB3156"/>
+    <w:multiLevelType w:val="multilevel"/>
+    <w:tmpl w:val="DD8CE20E"/>
+    <w:lvl w:ilvl="0">
+      <w:start w:val="1"/>
+      <w:numFmt w:val="bullet"/>
+      <w:lvlText w:val=""/>
+      <w:lvlJc w:val="left"/>
+      <w:pPr>
+        <w:tabs>
+          <w:tab w:val="num" w:pos="720"/>
+        </w:tabs>
+        <w:ind w:left="720" w:hanging="360"/>
+      </w:pPr>
+      <w:rPr>
+        <w:rFonts w:ascii="Symbol" w:hAnsi="Symbol" w:hint="default"/>
+        <w:sz w:val="20"/>
+      </w:rPr>
+    </w:lvl>
+    <w:lvl w:ilvl="1" w:tentative="1">
+      <w:start w:val="1"/>
+      <w:numFmt w:val="bullet"/>
+      <w:lvlText w:val="o"/>
+      <w:lvlJc w:val="left"/>
+      <w:pPr>
+        <w:tabs>
+          <w:tab w:val="num" w:pos="1440"/>
+        </w:tabs>
+        <w:ind w:left="1440" w:hanging="360"/>
+      </w:pPr>
+      <w:rPr>
+        <w:rFonts w:ascii="Courier New" w:hAnsi="Courier New" w:hint="default"/>
+        <w:sz w:val="20"/>
+      </w:rPr>
+    </w:lvl>
+    <w:lvl w:ilvl="2" w:tentative="1">
+      <w:start w:val="1"/>
+      <w:numFmt w:val="bullet"/>
+      <w:lvlText w:val=""/>
+      <w:lvlJc w:val="left"/>
+      <w:pPr>
+        <w:tabs>
+          <w:tab w:val="num" w:pos="2160"/>
+        </w:tabs>
+        <w:ind w:left="2160" w:hanging="360"/>
+      </w:pPr>
+      <w:rPr>
+        <w:rFonts w:ascii="Wingdings" w:hAnsi="Wingdings" w:hint="default"/>
+        <w:sz w:val="20"/>
+      </w:rPr>
+    </w:lvl>
+    <w:lvl w:ilvl="3" w:tentative="1">
+      <w:start w:val="1"/>
+      <w:numFmt w:val="bullet"/>
+      <w:lvlText w:val=""/>
+      <w:lvlJc w:val="left"/>
+      <w:pPr>
+        <w:tabs>
+          <w:tab w:val="num" w:pos="2880"/>
+        </w:tabs>
+        <w:ind w:left="2880" w:hanging="360"/>
+      </w:pPr>
+      <w:rPr>
+        <w:rFonts w:ascii="Wingdings" w:hAnsi="Wingdings" w:hint="default"/>
+        <w:sz w:val="20"/>
+      </w:rPr>
+    </w:lvl>
+    <w:lvl w:ilvl="4" w:tentative="1">
+      <w:start w:val="1"/>
+      <w:numFmt w:val="bullet"/>
+      <w:lvlText w:val=""/>
+      <w:lvlJc w:val="left"/>
+      <w:pPr>
+        <w:tabs>
+          <w:tab w:val="num" w:pos="3600"/>
+        </w:tabs>
+        <w:ind w:left="3600" w:hanging="360"/>
+      </w:pPr>
+      <w:rPr>
+        <w:rFonts w:ascii="Wingdings" w:hAnsi="Wingdings" w:hint="default"/>
+        <w:sz w:val="20"/>
+      </w:rPr>
+    </w:lvl>
+    <w:lvl w:ilvl="5" w:tentative="1">
+      <w:start w:val="1"/>
+      <w:numFmt w:val="bullet"/>
+      <w:lvlText w:val=""/>
+      <w:lvlJc w:val="left"/>
+      <w:pPr>
+        <w:tabs>
+          <w:tab w:val="num" w:pos="4320"/>
+        </w:tabs>
+        <w:ind w:left="4320" w:hanging="360"/>
+      </w:pPr>
+      <w:rPr>
+        <w:rFonts w:ascii="Wingdings" w:hAnsi="Wingdings" w:hint="default"/>
+        <w:sz w:val="20"/>
+      </w:rPr>
+    </w:lvl>
+    <w:lvl w:ilvl="6" w:tentative="1">
+      <w:start w:val="1"/>
+      <w:numFmt w:val="bullet"/>
+      <w:lvlText w:val=""/>
+      <w:lvlJc w:val="left"/>
+      <w:pPr>
+        <w:tabs>
+          <w:tab w:val="num" w:pos="5040"/>
+        </w:tabs>
+        <w:ind w:left="5040" w:hanging="360"/>
+      </w:pPr>
+      <w:rPr>
+        <w:rFonts w:ascii="Wingdings" w:hAnsi="Wingdings" w:hint="default"/>
+        <w:sz w:val="20"/>
+      </w:rPr>
+    </w:lvl>
+    <w:lvl w:ilvl="7" w:tentative="1">
+      <w:start w:val="1"/>
+      <w:numFmt w:val="bullet"/>
+      <w:lvlText w:val=""/>
+      <w:lvlJc w:val="left"/>
+      <w:pPr>
+        <w:tabs>
+          <w:tab w:val="num" w:pos="5760"/>
+        </w:tabs>
+        <w:ind w:left="5760" w:hanging="360"/>
+      </w:pPr>
+      <w:rPr>
+        <w:rFonts w:ascii="Wingdings" w:hAnsi="Wingdings" w:hint="default"/>
+        <w:sz w:val="20"/>
+      </w:rPr>
+    </w:lvl>
+    <w:lvl w:ilvl="8" w:tentative="1">
+      <w:start w:val="1"/>
+      <w:numFmt w:val="bullet"/>
+      <w:lvlText w:val=""/>
+      <w:lvlJc w:val="left"/>
+      <w:pPr>
+        <w:tabs>
+          <w:tab w:val="num" w:pos="6480"/>
+        </w:tabs>
+        <w:ind w:left="6480" w:hanging="360"/>
+      </w:pPr>
+      <w:rPr>
+        <w:rFonts w:ascii="Wingdings" w:hAnsi="Wingdings" w:hint="default"/>
+        <w:sz w:val="20"/>
+      </w:rPr>
+    </w:lvl>
+  </w:abstractNum>
+  <w:num w:numId="1" w16cid:durableId="1389111724">
+    <w:abstractNumId w:val="0"/>
+  </w:num>
+  <w:num w:numId="2" w16cid:durableId="1722629902">
+    <w:abstractNumId w:val="1"/>
+  </w:num>
+</w:numbering>
 </file>
 
 <file path=word/styles.xml><?xml version="1.0" encoding="utf-8"?>
@@ -616,7 +1949,6 @@
   <w:style w:type="character" w:default="1" w:styleId="DefaultParagraphFont">
     <w:name w:val="Default Paragraph Font"/>
     <w:uiPriority w:val="1"/>
-    <w:semiHidden/>
     <w:unhideWhenUsed/>
   </w:style>
   <w:style w:type="table" w:default="1" w:styleId="TableNormal">

</xml_diff>